<commit_message>
Restore original analyzer with approved preview updates
</commit_message>
<xml_diff>
--- a/DEPLOY-GUIDE.docx
+++ b/DEPLOY-GUIDE.docx
@@ -70,11 +70,9 @@
           <w:b/>
           <w:bCs/>
         </w:rPr>
-        <w:t xml:space="preserve">Your Anthropic API key </w:t>
-      </w:r>
-      <w:r>
-        <w:t xml:space="preserve">(from console.anthropic.com — this powers the AI)</w:t>
-      </w:r>
+        <w:t>Your Google Gemini API key (from aistudio.google.com — this powers the AI)</w:t>
+      </w:r>
+      <w:r/>
     </w:p>
     <w:p>
       <w:pPr>
@@ -178,11 +176,9 @@
           <w:b/>
           <w:bCs/>
         </w:rPr>
-        <w:t xml:space="preserve">Anthropic API: </w:t>
-      </w:r>
-      <w:r>
-        <w:t xml:space="preserve">~$0.01–0.03 per analysis (pay-as-you-go, very affordable)</w:t>
-      </w:r>
+        <w:t>Google Gemini API: usage-based pricing; review Google AI's current pricing before launch</w:t>
+      </w:r>
+      <w:r/>
     </w:p>
     <w:p>
       <w:pPr>
@@ -227,7 +223,7 @@
         <w:pStyle w:val="Heading1"/>
       </w:pPr>
       <w:r>
-        <w:t xml:space="preserve">Part 1: Get Your Anthropic API Key</w:t>
+        <w:t>Part 1: Get Your Google Gemini API Key</w:t>
       </w:r>
     </w:p>
     <w:p>
@@ -248,18 +244,15 @@
         <w:spacing w:after="80"/>
       </w:pPr>
       <w:r>
-        <w:t xml:space="preserve">Go to </w:t>
-      </w:r>
-      <w:r>
-        <w:rPr>
-          <w:b/>
-          <w:bCs/>
-        </w:rPr>
-        <w:t xml:space="preserve">console.anthropic.com</w:t>
-      </w:r>
-      <w:r>
-        <w:t xml:space="preserve"> and create an account (or sign in)</w:t>
-      </w:r>
+        <w:t>Go to aistudio.google.com and sign in with your Google account</w:t>
+      </w:r>
+      <w:r>
+        <w:rPr>
+          <w:b/>
+          <w:bCs/>
+        </w:rPr>
+      </w:r>
+      <w:r/>
     </w:p>
     <w:p>
       <w:pPr>
@@ -338,11 +331,9 @@
           <w:b/>
           <w:bCs/>
         </w:rPr>
-        <w:t xml:space="preserve">Copy the key immediately</w:t>
-      </w:r>
-      <w:r>
-        <w:t xml:space="preserve"> — it starts with sk-ant- and you won’t be able to see it again</w:t>
-      </w:r>
+        <w:t>Copy the key and store it securely — never commit it to GitHub or share it in chat</w:t>
+      </w:r>
+      <w:r/>
     </w:p>
     <w:p>
       <w:pPr>
@@ -753,24 +744,20 @@
         <w:spacing w:after="80"/>
       </w:pPr>
       <w:r>
-        <w:t xml:space="preserve">Add a new variable: name = </w:t>
-      </w:r>
-      <w:r>
-        <w:rPr>
-          <w:b/>
-          <w:bCs/>
-        </w:rPr>
-        <w:t xml:space="preserve">ANTHROPIC_API_KEY</w:t>
-      </w:r>
-      <w:r>
-        <w:t xml:space="preserve">  value = </w:t>
-      </w:r>
-      <w:r>
-        <w:rPr>
-          <w:b/>
-          <w:bCs/>
-        </w:rPr>
-        <w:t xml:space="preserve">your sk-ant- key from Part 1</w:t>
+        <w:t>Add a new variable: name = GOOGLE_API_KEY  value = your Google API key from Part 1</w:t>
+      </w:r>
+      <w:r>
+        <w:rPr>
+          <w:b/>
+          <w:bCs/>
+        </w:rPr>
+      </w:r>
+      <w:r/>
+      <w:r>
+        <w:rPr>
+          <w:b/>
+          <w:bCs/>
+        </w:rPr>
       </w:r>
     </w:p>
     <w:p>
@@ -1135,7 +1122,7 @@
         <w:spacing w:after="200"/>
       </w:pPr>
       <w:r>
-        <w:t xml:space="preserve">Check Railway’s deploy logs (click on your service → Deployments → View Logs). Usually this means a missing environment variable. Make sure ANTHROPIC_API_KEY is set in the Variables tab.</w:t>
+        <w:t>Check Railway’s deploy logs (click on your service → Deployments → View Logs). Usually this means a missing environment variable. Make sure GOOGLE_API_KEY is set in the Variables tab.</w:t>
       </w:r>
     </w:p>
     <w:p>
@@ -1151,7 +1138,7 @@
         <w:spacing w:after="200"/>
       </w:pPr>
       <w:r>
-        <w:t xml:space="preserve">The app falls back to demo mode if the API key isn’t set or is invalid. Double-check your ANTHROPIC_API_KEY in Railway’s Variables tab. Make sure it starts with sk-ant- and there are no extra spaces.</w:t>
+        <w:t>The app falls back to demo mode if the API key isn’t set or is invalid. Double-check your GOOGLE_API_KEY in Railway’s Variables tab. Make sure there are no extra spaces and that the key has not been revoked.</w:t>
       </w:r>
     </w:p>
     <w:p>

</xml_diff>